<commit_message>
Update project handover and executable instructions
</commit_message>
<xml_diff>
--- a/docs/AVERILL_SYSTEM_DESIGN.docx
+++ b/docs/AVERILL_SYSTEM_DESIGN.docx
@@ -25,7 +25,7 @@
     </ns0:p>
     <ns0:p>
       <ns0:r>
-        <ns0:t xml:space="preserve">This document describes the implemented hackathon prototype and the boundaries for extending it. The current app is an Electron desktop demo with three supplied Aurelia Travel work windows, a local company workspace, owner-scoped guided learning and weekly practice, and explicit one-frame OCR of a selected external Canva window. General continuous external application observation remains a future milestone.</ns0:t>
+        <ns0:t>This document describes the implemented hackathon prototype and the boundaries for extending it. The current app is an Electron desktop demo with four supplied Elseweek work windows, a local company workspace, owner-scoped guided learning and weekly practice, and explicit one-frame OCR of a selected external Canva window. General continuous external application observation remains a future milestone.</ns0:t>
       </ns0:r>
     </ns0:p>
     <ns0:p>
@@ -96,7 +96,7 @@
     </ns0:p>
     <ns0:p>
       <ns0:r>
-        <ns0:t xml:space="preserve">| Work renderer | travel-desktop/src/work.html, work.js | Synthetic email, social, handover fields and explicit draft save |</ns0:t>
+        <ns0:t>| Work renderer | travel-desktop/src/work.html, work.js | Synthetic email, LinkedIn, social, handover fields and explicit draft save |</ns0:t>
       </ns0:r>
     </ns0:p>
     <ns0:p>
@@ -121,7 +121,7 @@
     </ns0:p>
     <ns0:p>
       <ns0:r>
-        <ns0:t xml:space="preserve">| Company workspace | travel-desktop/src/workspace.js | Local people, role switching, imported copies, approval, priority, and conflict detection |</ns0:t>
+        <ns0:t>| Company workspace | travel-desktop/src/workspace.js | Local accounts, session access, imported copies, approval, priority, and conflict detection |</ns0:t>
       </ns0:r>
     </ns0:p>
     <ns0:p>
@@ -242,7 +242,7 @@
     </ns0:p>
     <ns0:p>
       <ns0:r>
-        <ns0:t xml:space="preserve">The preload exposes snapshot(), openWork(kind), share(kind, enabled), aiMode(enabled), ask(question), askDemo(question), source(id), openSource(id), updateWork(kind, data), and snapshot/sharing listeners. It also exposes narrow workspace, Tavily, and external-window methods. kind is limited to email, social, or handover. Main-process work:update accepts only events from the corresponding open work window and a plain object payload. The bridge uses context isolation, disables Node integration, and enables renderer sandboxing.</ns0:t>
+        <ns0:t>The preload exposes snapshot(), openWork(kind), share(kind, enabled), aiMode(enabled), ask(question), askDemo(question), source(id), openSource(id), updateWork(kind, data), and snapshot/sharing listeners. It also exposes narrow workspace, Tavily, and external-window methods. kind is limited to email, linkedin, social, or handover. Main-process work:update accepts only events from the corresponding open work window and a plain object payload. The bridge uses context isolation, disables Node integration, and enables renderer sandboxing.</ns0:t>
       </ns0:r>
     </ns0:p>
     <ns0:p>
@@ -291,17 +291,17 @@
     </ns0:p>
     <ns0:p>
       <ns0:r>
-        <ns0:t xml:space="preserve">The supplied work windows save draft form state in renderer localStorage only when the employee selects Save draft. There is no authenticated account, cloud database, migration, or deployment pipeline. The app runs locally with npm ci and npm start; npm test runs Node's test runner. npm run package:mac builds an unsigned arm64 demo .app with the Swift OCR helper. The current prototype has no telemetry or crash reporting. Distribution for real company content still needs signing, updates, permissions, and data retention design.</ns0:t>
-      </ns0:r>
-    </ns0:p>
-    <ns0:p>
-      <ns0:r>
-        <ns0:t xml:space="preserve">The company workspace is now stored as JSON in Electron's user-data directory, with imported copies and extracted text in an adjacent private local folder. Role switching is a one-computer demonstration of authorization rules, not account authentication. The assistant main process enforces file visibility and source approval before answering. An administrator or department lead can approve proposed department sources. Private files remain visible only to their owner until proposed. The conflict detector currently catches different approved files sharing the same department and title; it cannot detect all semantic contradictions.</ns0:t>
-      </ns0:r>
-    </ns0:p>
-    <ns0:p>
-      <ns0:r>
-        <ns0:t xml:space="preserve">Nebius receives only a question/draft and relevant approved text sources after session opt-in; draft and OCR review also prompt before sending. Tavily receives only the explicit web query and returns external URLs. The new Nebius company-source path has not passed a live request in this session because automated computer-use approval rejected that data transfer. Do not infer success from the older fixed-source Nebius check.</ns0:t>
+        <ns0:t>The supplied work windows save draft form state in renderer localStorage only when the employee selects Save draft. Separate local email/password accounts now identify the owner, marketing manager, strategist and content creator. No cloud authentication or synchronization is implemented. The app runs locally with npm ci and npm start; npm test runs Node's test runner. npm run package:mac builds an unsigned arm64 demo .app with the Swift OCR helper. The current prototype has no telemetry or crash reporting. Distribution for real company content still needs signing, updates, permissions, and data retention design.</ns0:t>
+      </ns0:r>
+    </ns0:p>
+    <ns0:p>
+      <ns0:r>
+        <ns0:t>The company workspace is now stored as JSON in Electron's user-data directory, with imported copies and extracted text in an adjacent private local folder. Owner activation replaces role switching with separate local email/password authentication. Main-process session checks enforce role access; restart requires sign-in. The assistant main process enforces file visibility and source approval before answering. An administrator or department lead can approve proposed department sources. Private files remain visible only to their owner until proposed. The conflict detector currently catches different approved files sharing the same department and title; it cannot detect all semantic contradictions.</ns0:t>
+      </ns0:r>
+    </ns0:p>
+    <ns0:p>
+      <ns0:r>
+        <ns0:t>Nebius receives question/draft and relevant approved text sources after consent; intake interpretation has separate file-text consent. Tavily receives only the explicit public query and returns external URLs. Live Nemotron intake checks passed for mixed files and three employees in unstructured prose. Prior approved company-source answering verification and remaining acceptance checks are recorded in docs/HANDOVER.md.</ns0:t>
       </ns0:r>
     </ns0:p>
     <ns0:p>
@@ -339,7 +339,7 @@
     </ns0:p>
     <ns0:p>
       <ns0:r>
-        <ns0:t xml:space="preserve">- The assistant and supplied Aurelia work windows use Petrol / Coral / Ice, bundled fonts and matching outline icons. The Review pane has a focused finding and source hierarchy; operational controls are in Work.</ns0:t>
+        <ns0:t>- The assistant and supplied Elseweek work windows use Petrol / Coral / Ice, bundled fonts and matching outline icons. The Review pane has a focused finding and source hierarchy; operational controls are in Work.</ns0:t>
       </ns0:r>
     </ns0:p>
     <ns0:p>
@@ -352,7 +352,7 @@
     </ns0:p>
     <ns0:p>
       <ns0:r>
-        <ns0:t xml:space="preserve">Verify the existing one-frame macOS Canva selection, permission handling, OCR, and Stop sharing end to end. Rehearse the packaged app and approved company-source Nebius path. Then add authentication/synchronization, stronger source-conflict and citation checks, and deletion/revocation behavior. Keep work actions human-owned unless the product decision changes explicitly. See docs/HANDOVER.md for the current checks and their evidence boundaries.</ns0:t>
+        <ns0:t>Verify the existing one-frame macOS Canva selection, permission handling, OCR, and Stop sharing end to end. Rehearse the packaged app and approved company-source Nebius path. Then evaluate cloud authentication and synchronization, stronger source-conflict and citation checks, and deletion/revocation behavior. Keep work actions human-owned unless the product decision changes explicitly. See docs/HANDOVER.md for the current checks and their evidence boundaries.</ns0:t>
       </ns0:r>
     </ns0:p>
     <ns0:p>
@@ -380,7 +380,43 @@
     </ns0:p>
     <ns0:p>
       <ns0:r>
-        <ns0:t xml:space="preserve">Learn is offline and stores no screenshots. The official guide opens only on an employee action. It neither connects to Canva’s document API nor proves element alignment. Existing Work capture is a separate explicit one-frame OCR route. Local role switching provides demonstration isolation, not authenticated security across devices.</ns0:t>
+        <ns0:t>Learn is offline and stores no screenshots. The official guide opens only on an employee action. It neither connects to Canva’s document API nor proves element alignment. Existing Work capture is a separate explicit one-frame OCR route. Local account sessions isolate employee history on one Mac; there is no authentication or synchronization across devices.</ns0:t>
+      </ns0:r>
+    </ns0:p>
+    <ns0:p>
+      <ns0:pPr>
+        <ns0:pStyle ns0:val="Heading1"/>
+      </ns0:pPr>
+      <ns0:r>
+        <ns0:t>Company onboarding and login documents</ns0:t>
+      </ns0:r>
+    </ns0:p>
+    <ns0:p>
+      <ns0:r>
+        <ns0:t>Updated 26 September 2026. ARCHITECTURE.md is the canonical system design; docs/HANDOVER.md records verification and remaining work. The desktop app accepts mixed Excel, CSV, PDF, SVG, text and image batches. Structured rosters are extracted locally. Nebius interprets bounded extracted text only after explicit consent and requires matching source evidence for employee identities. The owner reviews people, scopes, versions and approvals before applying the batch. Personnel files remain private; approved company brand sources are visible across departments.</ns0:t>
+      </ns0:r>
+    </ns0:p>
+    <ns0:p>
+      <ns0:r>
+        <ns0:t>Four profiles map owner to admin, marketing manager to lead, and marketing strategy employee and content creator to employee. Passwords use asynchronous scrypt hashes. At the user's request, owner and generated team credentials also receive separate local Markdown login documents under userData/Averill-login-documents. Only an authenticated administrator can open the folder through Account access. Documents are outside Git, company source ingestion, snapshots and Nebius prompts. There is no password reset or invitation delivery.</ns0:t>
+      </ns0:r>
+    </ns0:p>
+    <ns0:p>
+      <ns0:pPr>
+        <ns0:pStyle ns0:val="Heading1"/>
+      </ns0:pPr>
+      <ns0:r>
+        <ns0:t>Build and development continuation</ns0:t>
+      </ns0:r>
+    </ns0:p>
+    <ns0:p>
+      <ns0:r>
+        <ns0:t>Open travel-desktop/dist/Averill-darwin-arm64/Averill.app on Apple Silicon macOS. The archive is travel-desktop/dist/Averill-macOS-arm64.zip. Both are unsigned, ignored build outputs. Run npm test and npm run package:mac from travel-desktop. Nineteen Node tests pass, including four login documents surviving reload. The rebuilt app requires a manual final rehearsal of the real chooser and folder-opening action.</ns0:t>
+      </ns0:r>
+    </ns0:p>
+    <ns0:p>
+      <ns0:r>
+        <ns0:t>The normal user workspace remains Aurelia Demo with one legacy administrator and no configured login. The user must choose between activating four logins there and a separate Elseweek demo. Never confuse synthetic /tmp test profiles with the normal workspace. No current password was reset. Read HANDOVER.md, AGENTS.md, PROJECT.md, ARCHITECTURE.md, ONBOARDING_AUTH_PLAN.md and ONBOARDING_TUTORIAL.md before continuing.</ns0:t>
       </ns0:r>
     </ns0:p>
     <ns0:sectPr>

</xml_diff>

<commit_message>
Prepare usable local demo accounts and encrypted services
</commit_message>
<xml_diff>
--- a/docs/AVERILL_SYSTEM_DESIGN.docx
+++ b/docs/AVERILL_SYSTEM_DESIGN.docx
@@ -411,12 +411,12 @@
     </ns0:p>
     <ns0:p>
       <ns0:r>
-        <ns0:t>Open travel-desktop/dist/Averill-darwin-arm64/Averill.app on Apple Silicon macOS. The archive is travel-desktop/dist/Averill-macOS-arm64.zip. Both are unsigned, ignored build outputs. Run npm test and npm run package:mac from travel-desktop. Nineteen Node tests pass, including four login documents surviving reload. The rebuilt app requires a manual final rehearsal of the real chooser and folder-opening action.</ns0:t>
-      </ns0:r>
-    </ns0:p>
-    <ns0:p>
-      <ns0:r>
-        <ns0:t>The normal user workspace remains Aurelia Demo with one legacy administrator and no configured login. The user must choose between activating four logins there and a separate Elseweek demo. Never confuse synthetic /tmp test profiles with the normal workspace. No current password was reset. Read HANDOVER.md, AGENTS.md, PROJECT.md, ARCHITECTURE.md, ONBOARDING_AUTH_PLAN.md and ONBOARDING_TUTORIAL.md before continuing.</ns0:t>
+        <ns0:t>Open travel-desktop/dist/Averill-darwin-arm64/Averill.app on Apple Silicon macOS. The unsigned archive is travel-desktop/dist/Averill-macOS-arm64.zip. Run npm test and npm run package:mac from travel-desktop. Nineteen tests pass. Normal workspace checks with final bundle resources verified four logins, logout, restricted document access and encrypted service loading. The final app was launched natively and displayed all four profiles. Nebius authentication and Tavily search passed. Real file-chooser and company-document AI acceptance remain open.</ns0:t>
+      </ns0:r>
+    </ns0:p>
+    <ns0:p>
+      <ns0:r>
+        <ns0:t>Aurelia Demo now has four working logins: Demo Admin as owner, Maya as manager, Emma as strategist and Oscar as creator. Actual passwords are in the local demo-login-documents folder, ignored by Git; originals remain in userData/Averill-login-documents. Both API keys are preconfigured in encrypted storage on this Mac. The workspace was backed up; no old password was reset. HANDOVER.md contains the full continuation instructions.</ns0:t>
       </ns0:r>
     </ns0:p>
     <ns0:sectPr>

</xml_diff>

<commit_message>
Add multisource company intake and explicit AI confidentiality controls
</commit_message>
<xml_diff>
--- a/docs/AVERILL_SYSTEM_DESIGN.docx
+++ b/docs/AVERILL_SYSTEM_DESIGN.docx
@@ -4,7 +4,7 @@
   <ns0:body>
     <ns0:p>
       <ns0:r>
-        <ns0:t xml:space="preserve">Architecture export · updated 26 September 2026. Canonical source: ARCHITECTURE.md. Execution handover: docs/HANDOVER.md.</ns0:t>
+        <ns0:t>Architecture export · updated 27 September 2026. Canonical source: ARCHITECTURE.md. Execution handover: docs/HANDOVER.md.</ns0:t>
       </ns0:r>
     </ns0:p>
     <ns0:p>
@@ -214,7 +214,7 @@
     </ns0:p>
     <ns0:p>
       <ns0:r>
-        <ns0:t xml:space="preserve">       send question + relevant approved text sources to Nebius</ns0:t>
+        <ns0:t>send question + relevant approved, AI-permitted text sources to Nebius only when owner company AI policy is enabled</ns0:t>
       </ns0:r>
     </ns0:p>
     <ns0:p>
@@ -273,7 +273,7 @@
     </ns0:p>
     <ns0:p>
       <ns0:r>
-        <ns0:t xml:space="preserve">Local answers and deterministic findings need no network. Nebius uses NEBIUS_API_KEY from the environment/root .env.local or encrypted local Setup storage. The employee enables Nebius for the session. A Review question with a shared demo window can send the question and fixed synthetic text pack; a company question can send relevant approved company text. Draft or OCR text is sent only after a separate confirmation in its review flow. The API key remains in the main process. The app does not send image binaries or perform continuous capture. If the model cannot be reached, returns malformed output, or fails citation validation, a local answer is used. Citation IDs are structurally validated; model sentences are not independently checked against passages.</ns0:t>
+        <ns0:t>Local answers and deterministic findings need no network. Nebius uses NEBIUS_API_KEY from the environment/root .env.local or encrypted local Setup storage. Owner company policy and document permissions govern company AI; the employee enables Nebius for the session. A Review question with a shared demo window can send the question and fixed synthetic text pack; a company question can send relevant approved company text. Draft or OCR text is sent only after a separate confirmation in its review flow. The API key remains in the main process. The app does not send image binaries or perform continuous capture. If the model cannot be reached, returns malformed output, or fails citation validation, a local answer is used. Citation IDs are structurally validated; model sentences are not independently checked against passages.</ns0:t>
       </ns0:r>
     </ns0:p>
     <ns0:p>
@@ -291,7 +291,7 @@
     </ns0:p>
     <ns0:p>
       <ns0:r>
-        <ns0:t>The supplied work windows save draft form state in renderer localStorage only when the employee selects Save draft. Separate local email/password accounts now identify the owner, marketing manager, strategist and content creator. No cloud authentication or synchronization is implemented. The app runs locally with npm ci and npm start; npm test runs Node's test runner. npm run package:mac builds an unsigned arm64 demo .app with the Swift OCR helper. The current prototype has no telemetry or crash reporting. Distribution for real company content still needs signing, updates, permissions, and data retention design.</ns0:t>
+        <ns0:t>The supplied work windows save draft form state in renderer localStorage only when the employee selects Save draft. Separate local email/password accounts now identify the owner, marketing manager, strategist and content creator. Cloud file access uses registered-client OAuth; employee cloud login and background synchronization are not implemented. The app runs locally with npm ci and npm start; npm test runs Node's test runner. npm run package:mac builds an unsigned arm64 demo .app with the Swift OCR helper. The current prototype has no telemetry or crash reporting. Distribution for real company content still needs signing, updates, permissions, and data retention design.</ns0:t>
       </ns0:r>
     </ns0:p>
     <ns0:p>
@@ -393,7 +393,7 @@
     </ns0:p>
     <ns0:p>
       <ns0:r>
-        <ns0:t>Updated 26 September 2026. ARCHITECTURE.md is the canonical system design; docs/HANDOVER.md records verification and remaining work. The desktop app accepts mixed Excel, CSV, PDF, SVG, text and image batches. Structured rosters are extracted locally. Nebius interprets bounded extracted text only after explicit consent and requires matching source evidence for employee identities. The owner reviews people, scopes, versions and approvals before applying the batch. Personnel files remain private; approved company brand sources are visible across departments.</ns0:t>
+        <ns0:t>Updated 27 September 2026. ARCHITECTURE.md is canonical; HANDOVER.md records verification. Desktop/Finder drop, local and synced Drive/OneDrive files, HTTPS links and selected-file Google/Microsoft OAuth imports feed one local review. Registered OAuth clients are required; live cloud login is unverified. Structured rosters are extracted locally. The owner reviews identities, scopes, versions and approvals. Personnel files remain private. See CLOUD_CONNECTIONS.md for setup.</ns0:t>
       </ns0:r>
     </ns0:p>
     <ns0:p>
@@ -411,12 +411,12 @@
     </ns0:p>
     <ns0:p>
       <ns0:r>
-        <ns0:t>Open travel-desktop/dist/Averill-darwin-arm64/Averill.app on Apple Silicon macOS. The unsigned archive is travel-desktop/dist/Averill-macOS-arm64.zip. Run npm test and npm run package:mac from travel-desktop. Nineteen tests pass. Normal workspace checks with final bundle resources verified four logins, logout, restricted document access and encrypted service loading. The final app was launched natively and displayed all four profiles. Nebius authentication and Tavily search passed. Real file-chooser and company-document AI acceptance remain open.</ns0:t>
-      </ns0:r>
-    </ns0:p>
-    <ns0:p>
-      <ns0:r>
-        <ns0:t>Aurelia Demo now has four working logins: Demo Admin as owner, Maya as manager, Emma as strategist and Oscar as creator. Actual passwords are in the local demo-login-documents folder, ignored by Git; originals remain in userData/Averill-login-documents. Both API keys are preconfigured in encrypted storage on this Mac. The workspace was backed up; no old password was reset. HANDOVER.md contains the full continuation instructions.</ns0:t>
+        <ns0:t>Open travel-desktop/dist/Averill-darwin-arm64/Averill.app on Apple Silicon macOS; archive: dist/Averill-macOS-arm64.zip. Run npm test and npm run package:mac from travel-desktop. Twenty-five tests pass, including OAuth callback/state, encrypted tokens, HTTPS controls and private-source exclusions. Native bundle checks verified real-file preload import, synced XLSX append, local default and missing-client errors. Four prepared logins and encrypted service keys remain intact.</ns0:t>
+      </ns0:r>
+    </ns0:p>
+    <ns0:p>
+      <ns0:r>
+        <ns0:t>Company AI defaults off. Owner authorization and explicit file selection are required; restricted or credential-looking sources cannot enter Nebius prompts. OAuth consent is separate from AI permission. Provider confidentiality, retention, region and training opt-out require account-specific verification. Local company copies use OS permissions, not application encryption. See COMPANY_CONFIDENTIALITY.md for production gaps. Password documents remain local and ignored by Git.</ns0:t>
       </ns0:r>
     </ns0:p>
     <ns0:sectPr>

</xml_diff>

<commit_message>
Show action outcomes and browsable company knowledge
</commit_message>
<xml_diff>
--- a/docs/AVERILL_SYSTEM_DESIGN.docx
+++ b/docs/AVERILL_SYSTEM_DESIGN.docx
@@ -393,7 +393,7 @@
     </ns0:p>
     <ns0:p>
       <ns0:r>
-        <ns0:t>Updated 27 September 2026. ARCHITECTURE.md is canonical; HANDOVER.md records verification. Desktop/Finder drop, local and synced Drive/OneDrive files, HTTPS links and selected-file Google/Microsoft OAuth imports feed one local review. Registered OAuth clients are required; live cloud login is unverified. Structured rosters are extracted locally. The owner reviews identities, scopes, versions and approvals. Personnel files remain private. See CLOUD_CONNECTIONS.md for setup.</ns0:t>
+        <ns0:t>Updated 27 September 2026. File drop, local/synced files, HTTPS links and selected-file cloud imports feed local review. Knowledge shows uploaded proposals immediately and saved sources by role, with title/text search, status filters and local reading. Approval is separate from receipt and AI consent. Cloud OAuth requires registered clients and is live-unverified. See CLOUD_CONNECTIONS.md and ONBOARDING_TUTORIAL.md.</ns0:t>
       </ns0:r>
     </ns0:p>
     <ns0:p>
@@ -411,7 +411,7 @@
     </ns0:p>
     <ns0:p>
       <ns0:r>
-        <ns0:t>Open travel-desktop/dist/Averill-darwin-arm64/Averill.app on Apple Silicon macOS; archive: dist/Averill-macOS-arm64.zip. Run npm test and npm run package:mac from travel-desktop. Twenty-five tests pass, including OAuth callback/state, encrypted tokens, HTTPS controls and private-source exclusions. Native bundle checks verified real-file preload import, synced XLSX append, local default and missing-client errors. Four prepared logins and encrypted service keys remain intact.</ns0:t>
+        <ns0:t>Open travel-desktop/dist/Averill-darwin-arm64/Averill.app on Apple Silicon macOS; archive: dist/Averill-macOS-arm64.zip. A persistent banner reports working, completed, cancelled and failed actions. Intake reports received/readable files and warnings. Twenty-six tests pass. Native feedback checks verify proposal visibility, local text reading, approved knowledge, search, viewport and logout cleanup. Reproduce with npm run verify:feedback; HANDOVER.md records the evidence.</ns0:t>
       </ns0:r>
     </ns0:p>
     <ns0:p>

</xml_diff>

<commit_message>
Add guided practice, evidence review and local account controls
</commit_message>
<xml_diff>
--- a/docs/AVERILL_SYSTEM_DESIGN.docx
+++ b/docs/AVERILL_SYSTEM_DESIGN.docx
@@ -12,7 +12,7 @@
         <ns0:pStyle ns0:val="Heading1"/>
       </ns0:pPr>
       <ns0:r>
-        <ns0:t xml:space="preserve">Averill system design</ns0:t>
+        <ns0:t>Averill system design</ns0:t>
       </ns0:r>
     </ns0:p>
     <ns0:p>
@@ -20,7 +20,7 @@
         <ns0:pStyle ns0:val="Heading2"/>
       </ns0:pPr>
       <ns0:r>
-        <ns0:t xml:space="preserve">Purpose and status</ns0:t>
+        <ns0:t>Purpose and status</ns0:t>
       </ns0:r>
     </ns0:p>
     <ns0:p>
@@ -33,37 +33,37 @@
         <ns0:pStyle ns0:val="Heading2"/>
       </ns0:pPr>
       <ns0:r>
-        <ns0:t xml:space="preserve">Requirements</ns0:t>
-      </ns0:r>
-    </ns0:p>
-    <ns0:p>
-      <ns0:r>
-        <ns0:t xml:space="preserve">| Requirement | Current implementation |</ns0:t>
-      </ns0:r>
-    </ns0:p>
-    <ns0:p>
-      <ns0:r>
-        <ns0:t xml:space="preserve">| Explicit employee choice of shared work | Per-window Share/Stop controls in the Averill window |</ns0:t>
-      </ns0:r>
-    </ns0:p>
-    <ns0:p>
-      <ns0:r>
-        <ns0:t xml:space="preserve">| Feedback at a natural pause | Work windows send state after blur or selection change |</ns0:t>
-      </ns0:r>
-    </ns0:p>
-    <ns0:p>
-      <ns0:r>
-        <ns0:t xml:space="preserve">| Source-backed corrections | Deterministic findings carry a local source object |</ns0:t>
-      </ns0:r>
-    </ns0:p>
-    <ns0:p>
-      <ns0:r>
-        <ns0:t xml:space="preserve">| Campaign questions | Local lookup; optional Nebius source-constrained answer |</ns0:t>
-      </ns0:r>
-    </ns0:p>
-    <ns0:p>
-      <ns0:r>
-        <ns0:t xml:space="preserve">| Human control | No automatic edit, send, or publish route |</ns0:t>
+        <ns0:t>Requirements</ns0:t>
+      </ns0:r>
+    </ns0:p>
+    <ns0:p>
+      <ns0:r>
+        <ns0:t>| Requirement | Current implementation |</ns0:t>
+      </ns0:r>
+    </ns0:p>
+    <ns0:p>
+      <ns0:r>
+        <ns0:t>| Explicit employee choice of shared work | Per-window Share/Stop controls in the Averill window |</ns0:t>
+      </ns0:r>
+    </ns0:p>
+    <ns0:p>
+      <ns0:r>
+        <ns0:t>| Feedback at a natural pause | Work windows send state after blur or selection change |</ns0:t>
+      </ns0:r>
+    </ns0:p>
+    <ns0:p>
+      <ns0:r>
+        <ns0:t>| Source-backed corrections | Deterministic findings carry a local source object |</ns0:t>
+      </ns0:r>
+    </ns0:p>
+    <ns0:p>
+      <ns0:r>
+        <ns0:t>| Campaign questions | Local lookup; optional Nebius source-constrained answer |</ns0:t>
+      </ns0:r>
+    </ns0:p>
+    <ns0:p>
+      <ns0:r>
+        <ns0:t>| Human control | No automatic edit, send, or publish route |</ns0:t>
       </ns0:r>
     </ns0:p>
     <ns0:p>
@@ -71,27 +71,27 @@
         <ns0:pStyle ns0:val="Heading2"/>
       </ns0:pPr>
       <ns0:r>
-        <ns0:t xml:space="preserve">Components</ns0:t>
-      </ns0:r>
-    </ns0:p>
-    <ns0:p>
-      <ns0:r>
-        <ns0:t xml:space="preserve">| Component | File | Responsibility |</ns0:t>
-      </ns0:r>
-    </ns0:p>
-    <ns0:p>
-      <ns0:r>
-        <ns0:t xml:space="preserve">| Main process | travel-desktop/main.js | Creates windows, tracks open/shared state, computes snapshots, registers IPC handlers |</ns0:t>
-      </ns0:r>
-    </ns0:p>
-    <ns0:p>
-      <ns0:r>
-        <ns0:t xml:space="preserve">| Preload bridge | travel-desktop/preload.js | Exposes narrow window.desktop methods to sandboxed renderers |</ns0:t>
-      </ns0:r>
-    </ns0:p>
-    <ns0:p>
-      <ns0:r>
-        <ns0:t xml:space="preserve">| Averill renderer | travel-desktop/src/agent.html, agent.js | Window list, findings, question composer, source viewer, AI opt-in |</ns0:t>
+        <ns0:t>Components</ns0:t>
+      </ns0:r>
+    </ns0:p>
+    <ns0:p>
+      <ns0:r>
+        <ns0:t>| Component | File | Responsibility |</ns0:t>
+      </ns0:r>
+    </ns0:p>
+    <ns0:p>
+      <ns0:r>
+        <ns0:t>| Main process | travel-desktop/main.js | Creates windows, tracks open/shared state, computes snapshots, registers IPC handlers |</ns0:t>
+      </ns0:r>
+    </ns0:p>
+    <ns0:p>
+      <ns0:r>
+        <ns0:t>| Preload bridge | travel-desktop/preload.js | Exposes narrow window.desktop methods to sandboxed renderers |</ns0:t>
+      </ns0:r>
+    </ns0:p>
+    <ns0:p>
+      <ns0:r>
+        <ns0:t>| Averill renderer | travel-desktop/src/agent.html, agent.js | Window list, findings, question composer, source viewer, AI opt-in |</ns0:t>
       </ns0:r>
     </ns0:p>
     <ns0:p>
@@ -101,22 +101,22 @@
     </ns0:p>
     <ns0:p>
       <ns0:r>
-        <ns0:t xml:space="preserve">| Rule engine | travel-desktop/src/engine.js | Pure issue checks and local campaign answers |</ns0:t>
-      </ns0:r>
-    </ns0:p>
-    <ns0:p>
-      <ns0:r>
-        <ns0:t xml:space="preserve">| AI adapter | travel-desktop/src/assistant.js | Nebius model discovery, answer request, citation ID validation, local fallback |</ns0:t>
-      </ns0:r>
-    </ns0:p>
-    <ns0:p>
-      <ns0:r>
-        <ns0:t xml:space="preserve">| Source registry | travel-desktop/src/campaign.js | Maps fixed source IDs to local source files and assets |</ns0:t>
-      </ns0:r>
-    </ns0:p>
-    <ns0:p>
-      <ns0:r>
-        <ns0:t xml:space="preserve">| Design system | travel-desktop/design-system/ and src/agent-theme.css | Approved visual tokens and implemented assistant styling |</ns0:t>
+        <ns0:t>| Rule engine | travel-desktop/src/engine.js | Pure issue checks and local campaign answers |</ns0:t>
+      </ns0:r>
+    </ns0:p>
+    <ns0:p>
+      <ns0:r>
+        <ns0:t>| AI adapter | travel-desktop/src/assistant.js | Nebius model discovery, answer request, citation ID validation, local fallback |</ns0:t>
+      </ns0:r>
+    </ns0:p>
+    <ns0:p>
+      <ns0:r>
+        <ns0:t>| Source registry | travel-desktop/src/campaign.js | Maps fixed source IDs to local source files and assets |</ns0:t>
+      </ns0:r>
+    </ns0:p>
+    <ns0:p>
+      <ns0:r>
+        <ns0:t>| Design system | travel-desktop/design-system/ and src/agent-theme.css | Approved visual tokens and implemented assistant styling |</ns0:t>
       </ns0:r>
     </ns0:p>
     <ns0:p>
@@ -126,27 +126,27 @@
     </ns0:p>
     <ns0:p>
       <ns0:r>
-        <ns0:t xml:space="preserve">| Company answers | travel-desktop/src/workspace-answer.js | Approved-source retrieval, Nebius request, citation ID validation, local fallback |</ns0:t>
-      </ns0:r>
-    </ns0:p>
-    <ns0:p>
-      <ns0:r>
-        <ns0:t xml:space="preserve">| Learning engine | travel-desktop/src/learning.js | Owner-scoped sessions, ordered confirmation, weekly eligibility, practice and feedback |</ns0:t>
-      </ns0:r>
-    </ns0:p>
-    <ns0:p>
-      <ns0:r>
-        <ns0:t xml:space="preserve">| Learning UI | travel-desktop/src/learning-ui.js | Learn lesson/help, activity recording, weekly review and answer forms |</ns0:t>
-      </ns0:r>
-    </ns0:p>
-    <ns0:p>
-      <ns0:r>
-        <ns0:t xml:space="preserve">| Public search | travel-desktop/src/web-search.js | Tavily search with a user-entered public query only |</ns0:t>
-      </ns0:r>
-    </ns0:p>
-    <ns0:p>
-      <ns0:r>
-        <ns0:t xml:space="preserve">| macOS extraction | travel-desktop/scripts/extract-text.swift | PDF text and image OCR for imported files and selected-window frames |</ns0:t>
+        <ns0:t>| Company answers | travel-desktop/src/workspace-answer.js | Approved-source retrieval, Nebius request, citation ID validation, local fallback |</ns0:t>
+      </ns0:r>
+    </ns0:p>
+    <ns0:p>
+      <ns0:r>
+        <ns0:t>| Learning engine | travel-desktop/src/learning.js | Owner-scoped sessions, ordered confirmation, weekly eligibility, practice and feedback |</ns0:t>
+      </ns0:r>
+    </ns0:p>
+    <ns0:p>
+      <ns0:r>
+        <ns0:t>| Learning UI | travel-desktop/src/learning-ui.js | Learn lesson/help, activity recording, weekly review and answer forms |</ns0:t>
+      </ns0:r>
+    </ns0:p>
+    <ns0:p>
+      <ns0:r>
+        <ns0:t>| Public search | travel-desktop/src/web-search.js | Tavily search with a user-entered public query only |</ns0:t>
+      </ns0:r>
+    </ns0:p>
+    <ns0:p>
+      <ns0:r>
+        <ns0:t>| macOS extraction | travel-desktop/scripts/extract-text.swift | PDF text and image OCR for imported files and selected-window frames |</ns0:t>
       </ns0:r>
     </ns0:p>
     <ns0:p>
@@ -154,12 +154,12 @@
         <ns0:pStyle ns0:val="Heading2"/>
       </ns0:pPr>
       <ns0:r>
-        <ns0:t xml:space="preserve">Data flow</ns0:t>
-      </ns0:r>
-    </ns0:p>
-    <ns0:p>
-      <ns0:r>
-        <ns0:t xml:space="preserve">Employee edits supplied work window</ns0:t>
+        <ns0:t>Data flow</ns0:t>
+      </ns0:r>
+    </ns0:p>
+    <ns0:p>
+      <ns0:r>
+        <ns0:t>Employee edits supplied work window</ns0:t>
       </ns0:r>
     </ns0:p>
     <ns0:p>
@@ -194,7 +194,7 @@
     </ns0:p>
     <ns0:p>
       <ns0:r>
-        <ns0:t xml:space="preserve">Employee asks in Review</ns0:t>
+        <ns0:t>Employee asks in Review</ns0:t>
       </ns0:r>
     </ns0:p>
     <ns0:p>
@@ -229,7 +229,7 @@
     </ns0:p>
     <ns0:p>
       <ns0:r>
-        <ns0:t xml:space="preserve">The work window calls work:update even when unshared; the main process stores the state but does not produce findings until the window is shared. This is a boundary of the current implementation to consider during the future external-app integration. Closing a work window removes its state and sharing status.</ns0:t>
+        <ns0:t>The work window calls work:update even when unshared; the main process stores the state but does not produce findings until the window is shared. This is a boundary of the current implementation to consider during the future external-app integration. Closing a work window removes its state and sharing status.</ns0:t>
       </ns0:r>
     </ns0:p>
     <ns0:p>
@@ -237,7 +237,7 @@
         <ns0:pStyle ns0:val="Heading2"/>
       </ns0:pPr>
       <ns0:r>
-        <ns0:t xml:space="preserve">IPC contracts</ns0:t>
+        <ns0:t>IPC contracts</ns0:t>
       </ns0:r>
     </ns0:p>
     <ns0:p>
@@ -247,7 +247,7 @@
     </ns0:p>
     <ns0:p>
       <ns0:r>
-        <ns0:t xml:space="preserve">The snapshot contains open, shared, aiEnabled, findings, workspace, learning, service availability and the selected external window. A finding has an ID, title, explanation, suggested user action, source, and work kind. Source IDs resolve only through the fixed registry; arbitrary paths are not accepted through agent:source or agent:open-source.</ns0:t>
+        <ns0:t>The snapshot contains open, shared, aiEnabled, findings, workspace, learning, service availability and the selected external window. A finding has an ID, title, explanation, suggested user action, source, and work kind. Source IDs resolve only through the fixed registry; arbitrary paths are not accepted through agent:source or agent:open-source.</ns0:t>
       </ns0:r>
     </ns0:p>
     <ns0:p>
@@ -255,12 +255,12 @@
         <ns0:pStyle ns0:val="Heading2"/>
       </ns0:pPr>
       <ns0:r>
-        <ns0:t xml:space="preserve">Source and version model</ns0:t>
-      </ns0:r>
-    </ns0:p>
-    <ns0:p>
-      <ns0:r>
-        <ns0:t xml:space="preserve">The fixed campaign source pack is static and synthetic. current-brief.md is the approved v2. old-brief.md is v1 and intentionally superseded. brand-and-legal.md controls copy and disclosures. content-calendar.md controls dates. Approved assets are the email hero and vertical Reel; the old square creative is an intentional wrong choice. The separate company workspace has local file/folder import, status, version, owner, department, priority, and same-title conflict detection. That detection does not establish full semantic consistency.</ns0:t>
+        <ns0:t>Source and version model</ns0:t>
+      </ns0:r>
+    </ns0:p>
+    <ns0:p>
+      <ns0:r>
+        <ns0:t>The fixed campaign source pack is static and synthetic. current-brief.md is the approved v2. old-brief.md is v1 and intentionally superseded. brand-and-legal.md controls copy and disclosures. content-calendar.md controls dates. Approved assets are the email hero and vertical Reel; the old square creative is an intentional wrong choice. The separate company workspace has local file/folder import, status, version, owner, department, priority, and same-title conflict detection. That detection does not establish full semantic consistency.</ns0:t>
       </ns0:r>
     </ns0:p>
     <ns0:p>
@@ -268,7 +268,7 @@
         <ns0:pStyle ns0:val="Heading2"/>
       </ns0:pPr>
       <ns0:r>
-        <ns0:t xml:space="preserve">AI and privacy boundary</ns0:t>
+        <ns0:t>AI and privacy boundary</ns0:t>
       </ns0:r>
     </ns0:p>
     <ns0:p>
@@ -278,7 +278,7 @@
     </ns0:p>
     <ns0:p>
       <ns0:r>
-        <ns0:t xml:space="preserve">The public repository must never contain .env.local or credentials. .env.example lists variable names only. Do not log request headers, keys, or sensitive prompt content.</ns0:t>
+        <ns0:t>The public repository must never contain .env.local or credentials. .env.example lists variable names only. Do not log request headers, keys, or sensitive prompt content.</ns0:t>
       </ns0:r>
     </ns0:p>
     <ns0:p>
@@ -286,7 +286,7 @@
         <ns0:pStyle ns0:val="Heading2"/>
       </ns0:pPr>
       <ns0:r>
-        <ns0:t xml:space="preserve">Persistence and operations</ns0:t>
+        <ns0:t>Persistence and operations</ns0:t>
       </ns0:r>
     </ns0:p>
     <ns0:p>
@@ -306,7 +306,7 @@
     </ns0:p>
     <ns0:p>
       <ns0:r>
-        <ns0:t xml:space="preserve">Electron desktopCapturer lists windows. The user chooses a Canva-titled window; pressing Review captures one thumbnail frame, extracts visible text locally, and deletes the temporary PNG. Stop sharing clears the selected window. No continuous capture runs. A screenshot can miss hidden text or visual issues; the app labels the review as OCR.</ns0:t>
+        <ns0:t>Electron desktopCapturer lists windows. The user chooses a Canva-titled window; pressing Review captures one thumbnail frame, extracts visible text locally, and deletes the temporary PNG. Stop sharing clears the selected window. No continuous capture runs. A screenshot can miss hidden text or visual issues; the app labels the review as OCR.</ns0:t>
       </ns0:r>
     </ns0:p>
     <ns0:p>
@@ -314,27 +314,27 @@
         <ns0:pStyle ns0:val="Heading2"/>
       </ns0:pPr>
       <ns0:r>
-        <ns0:t xml:space="preserve">Known gaps and tradeoffs</ns0:t>
-      </ns0:r>
-    </ns0:p>
-    <ns0:p>
-      <ns0:r>
-        <ns0:t xml:space="preserve">- Deterministic checks make the demo repeatable but cover only explicit campaign errors.</ns0:t>
-      </ns0:r>
-    </ns0:p>
-    <ns0:p>
-      <ns0:r>
-        <ns0:t xml:space="preserve">- Structured work-window state is reliable but does not prove real desktop perception.</ns0:t>
-      </ns0:r>
-    </ns0:p>
-    <ns0:p>
-      <ns0:r>
-        <ns0:t xml:space="preserve">- Static local sources enable transparent citations but do not handle company-wide retrieval or live document changes.</ns0:t>
-      </ns0:r>
-    </ns0:p>
-    <ns0:p>
-      <ns0:r>
-        <ns0:t xml:space="preserve">- AI citations are checked for known IDs, not full factual entailment. Claims remain reviewable by the employee.</ns0:t>
+        <ns0:t>Known gaps and tradeoffs</ns0:t>
+      </ns0:r>
+    </ns0:p>
+    <ns0:p>
+      <ns0:r>
+        <ns0:t>- Deterministic checks make the demo repeatable but cover only explicit campaign errors.</ns0:t>
+      </ns0:r>
+    </ns0:p>
+    <ns0:p>
+      <ns0:r>
+        <ns0:t>- Structured work-window state is reliable but does not prove real desktop perception.</ns0:t>
+      </ns0:r>
+    </ns0:p>
+    <ns0:p>
+      <ns0:r>
+        <ns0:t>- Static local sources enable transparent citations but do not handle company-wide retrieval or live document changes.</ns0:t>
+      </ns0:r>
+    </ns0:p>
+    <ns0:p>
+      <ns0:r>
+        <ns0:t>- AI citations are checked for known IDs, not full factual entailment. Claims remain reviewable by the employee.</ns0:t>
       </ns0:r>
     </ns0:p>
     <ns0:p>
@@ -347,7 +347,7 @@
         <ns0:pStyle ns0:val="Heading2"/>
       </ns0:pPr>
       <ns0:r>
-        <ns0:t xml:space="preserve">Extension sequence</ns0:t>
+        <ns0:t>Extension sequence</ns0:t>
       </ns0:r>
     </ns0:p>
     <ns0:p>
@@ -360,22 +360,22 @@
         <ns0:pStyle ns0:val="Heading2"/>
       </ns0:pPr>
       <ns0:r>
-        <ns0:t xml:space="preserve">Learning state and IPC</ns0:t>
-      </ns0:r>
-    </ns0:p>
-    <ns0:p>
-      <ns0:r>
-        <ns0:t xml:space="preserve">learningAction(action, payload) invokes learning:action. Only the Averill renderer is accepted. The main process derives the active person from the workspace; payloads cannot choose another owner. Allowed actions: start, record, confirm, exclude, quiz and answer. The engine validates source eligibility, step order and answer shape before persistence and snapshot publication.</ns0:t>
-      </ns0:r>
-    </ns0:p>
-    <ns0:p>
-      <ns0:r>
-        <ns0:t xml:space="preserve">State lives in the learning field of the existing schema-1 workspace: sessions and quizzes, each owner-scoped. Sessions carry creation time, confirmed operation timestamps/week keys, optional source ID/title/version/hash and exclusion/completion state. Manual work records contain a confirmed employee description. Quizzes persist prompts, deterministic answer keys and feedback; snapshots omit answer keys. Practical reflections are explicitly self-confirmed, not model-graded.</ns0:t>
-      </ns0:r>
-    </ns0:p>
-    <ns0:p>
-      <ns0:r>
-        <ns0:t xml:space="preserve">Week keys are Monday-based in Europe/Copenhagen. Only confirmed current-week sessions are eligible. Company evidence must remain visible, approved, hash/version-matching and outside same-title conflicts. Excluding activity or invalidating evidence blocks affected questions. A fingerprint detects changed records so explicit refresh can create an updated set. Previous answers remain in local history; only the current person/current week is exposed by the learning snapshot.</ns0:t>
+        <ns0:t>Learning state and IPC</ns0:t>
+      </ns0:r>
+    </ns0:p>
+    <ns0:p>
+      <ns0:r>
+        <ns0:t>learningAction(action, payload) invokes learning:action. Only the Averill renderer is accepted. The main process derives the active person from the workspace; payloads cannot choose another owner. Allowed actions: start, record, confirm, exclude, quiz and answer. The engine validates source eligibility, step order and answer shape before persistence and snapshot publication.</ns0:t>
+      </ns0:r>
+    </ns0:p>
+    <ns0:p>
+      <ns0:r>
+        <ns0:t>State lives in the learning field of the existing schema-1 workspace: sessions and quizzes, each owner-scoped. Sessions carry creation time, confirmed operation timestamps/week keys, optional source ID/title/version/hash and exclusion/completion state. Manual work records contain a confirmed employee description. Quizzes persist prompts, deterministic answer keys and feedback; snapshots omit answer keys. Practical reflections are explicitly self-confirmed, not model-graded.</ns0:t>
+      </ns0:r>
+    </ns0:p>
+    <ns0:p>
+      <ns0:r>
+        <ns0:t>Week keys are Monday-based in Europe/Copenhagen. Only confirmed current-week sessions are eligible. Company evidence must remain visible, approved, hash/version-matching and outside same-title conflicts. Excluding activity or invalidating evidence blocks affected questions. A fingerprint detects changed records so explicit refresh can create an updated set. Previous answers remain in local history; only the current person/current week is exposed by the learning snapshot.</ns0:t>
       </ns0:r>
     </ns0:p>
     <ns0:p>
@@ -398,7 +398,7 @@
     </ns0:p>
     <ns0:p>
       <ns0:r>
-        <ns0:t>Four profiles map owner to admin, marketing manager to lead, and marketing strategy employee and content creator to employee. Passwords use asynchronous scrypt hashes. At the user's request, owner and generated team credentials also receive separate local Markdown login documents under userData/Averill-login-documents. Only an authenticated administrator can open the folder through Account access. Documents are outside Git, company source ingestion, snapshots and Nebius prompts. There is no password reset or invitation delivery.</ns0:t>
+        <ns0:t>Four profiles map owner to admin, marketing manager to lead, and marketing strategy employee and content creator to employee. Passwords use asynchronous scrypt hashes. At the user's request, owner and generated team credentials also receive separate local Markdown login documents under userData/Averill-login-documents. Only an authenticated administrator can open the folder through Account access. Documents are outside Git, company source ingestion, snapshots and Nebius prompts. Admin reset of another non-owner local account and self-service password change are available. No invitation delivery or unauthenticated owner recovery is implemented.</ns0:t>
       </ns0:r>
     </ns0:p>
     <ns0:p>
@@ -411,12 +411,35 @@
     </ns0:p>
     <ns0:p>
       <ns0:r>
-        <ns0:t>Open travel-desktop/dist/Averill-darwin-arm64/Averill.app on Apple Silicon macOS; archive: dist/Averill-macOS-arm64.zip. A persistent banner reports working, completed, cancelled and failed actions. Intake reports received/readable files and warnings. Twenty-six tests pass. Native feedback checks verify proposal visibility, local text reading, approved knowledge, search, viewport and logout cleanup. Reproduce with npm run verify:feedback; HANDOVER.md records the evidence.</ns0:t>
+        <ns0:t>Open travel-desktop/dist/Averill-darwin-arm64/Averill.app on Apple Silicon macOS; archive: dist/Averill-macOS-arm64.zip. A persistent banner reports working, completed, cancelled and failed actions. Intake reports received/readable files and warnings. Thirty-three Node tests pass as of 28 September 2026. Native feedback checks verify proposal visibility, local text reading, approved knowledge, search, viewport and logout cleanup. Reproduce with npm run verify:feedback; HANDOVER.md records the evidence.</ns0:t>
       </ns0:r>
     </ns0:p>
     <ns0:p>
       <ns0:r>
         <ns0:t>Company AI defaults off. Owner authorization and explicit file selection are required; restricted or credential-looking sources cannot enter Nebius prompts. OAuth consent is separate from AI permission. Provider confidentiality, retention, region and training opt-out require account-specific verification. Local company copies use OS permissions, not application encryption. See COMPANY_CONFIDENTIALITY.md for production gaps. Password documents remain local and ignored by Git.</ns0:t>
+      </ns0:r>
+    </ns0:p>
+    <ns0:p>
+      <ns0:pPr>
+        <ns0:pStyle ns0:val="Heading1"/>
+      </ns0:pPr>
+      <ns0:r>
+        <ns0:t>Addition pass — 28 September 2026</ns0:t>
+      </ns0:r>
+    </ns0:p>
+    <ns0:p>
+      <ns0:r>
+        <ns0:t>Review findings can start a person-owned correction exercise, copy the suggested correction and recheck supported shared fields after a human edit. Learn adds composition, LinkedIn visual and newsletter export projects, bounded offline step questions, and an optional explicit one-frame Canva OCR capture. Employee confirmation remains separate from deterministic rule clearance; export and geometry are not verified.</ns0:t>
+      </ns0:r>
+    </ns0:p>
+    <ns0:p>
+      <ns0:r>
+        <ns0:t>Company answers cite exact extracted passages with version, approval metadata and line/page when available. Optional model answers are accepted only as exact extracts of validated source quotes. Knowledge supports local search filters, a bounded line comparison, reviewer reasons, explicit replacement links across different titles and private clarification requests.</ns0:t>
+      </ns0:r>
+    </ns0:p>
+    <ns0:p>
+      <ns0:r>
+        <ns0:t>Admins can disable/reset another non-owner local account; signed-in people can change their own passwords. Managed source copies and personal learning history can be deleted explicitly. Applied onboarding staging files are cleaned up. Workspace text and source copies are not application-encrypted. Multi-device sync, production tenant isolation, delivered invitations, signed/notarized distribution and live OAuth proof remain external release gates. See docs/ADDITIONS_STATUS.md, docs/AB_TEST_PLAN.md and docs/HANDOVER.md for exact status and verification.</ns0:t>
       </ns0:r>
     </ns0:p>
     <ns0:sectPr>

</xml_diff>

<commit_message>
Publish guided preview handover and synchronize project documents
</commit_message>
<xml_diff>
--- a/docs/AVERILL_SYSTEM_DESIGN.docx
+++ b/docs/AVERILL_SYSTEM_DESIGN.docx
@@ -3,7 +3,77 @@
 <ns0:document xmlns:ns0="http://schemas.openxmlformats.org/wordprocessingml/2006/main" xmlns:ns1="http://schemas.openxmlformats.org/officeDocument/2006/relationships">
   <ns0:body>
     <ns0:p>
-      <ns0:r>
+      <ns0:pPr>
+        <ns0:pStyle ns0:val="Title"/>
+      </ns0:pPr>
+      <ns0:r>
+        <ns0:rPr>
+          <ns0:color ns0:val="000000"/>
+        </ns0:rPr>
+        <ns0:t>Averill system design current release</ns0:t>
+      </ns0:r>
+    </ns0:p>
+    <ns0:p>
+      <ns0:r>
+        <ns0:rPr>
+          <ns0:color ns0:val="000000"/>
+        </ns0:rPr>
+        <ns0:t>Updated 4 October 2026. The Guided UI preview is public for Apple Silicon macOS 13 and later. Build source 50e5c61. Older design sections below are historical where superseded; PROJECT_STATUS_2026-10-04.md and HANDOVER.md are the operational entry points.</ns0:t>
+      </ns0:r>
+    </ns0:p>
+    <ns0:p>
+      <ns0:r>
+        <ns0:rPr>
+          <ns0:color ns0:val="000000"/>
+        </ns0:rPr>
+        <ns0:t>Public release: https://github.com/sararr25/averill-ai/releases/tag/v0.1.0-preview.20261004.2</ns0:t>
+      </ns0:r>
+    </ns0:p>
+    <ns0:p>
+      <ns0:r>
+        <ns0:rPr>
+          <ns0:color ns0:val="000000"/>
+        </ns0:rPr>
+        <ns0:t>Work now guides explicit sharing, approved-rule checks and evidence review. External results appear in Review with observed excerpts, suggestions and versioned sources. Native motion supports reduced motion. Setup, Knowledge and Learn use clearer action hierarchy.</ns0:t>
+      </ns0:r>
+    </ns0:p>
+    <ns0:p>
+      <ns0:r>
+        <ns0:rPr>
+          <ns0:color ns0:val="000000"/>
+        </ns0:rPr>
+        <ns0:t>47 automated tests and isolated native/source and bundled-resource regressions pass. The ZIP matches 120 tracked source files, both native helpers and 3109 bundle entries. SHA-256: 38499d6041da183209478f48a5bde3b1f363503733b761ac040da98cc91aa36b.</ns0:t>
+      </ns0:r>
+    </ns0:p>
+    <ns0:p>
+      <ns0:r>
+        <ns0:rPr>
+          <ns0:color ns0:val="000000"/>
+        </ns0:rPr>
+        <ns0:t>The Chrome extension is installed. Selected-field tests on local fake Brevo, Instagram and LinkedIn have prior evidence. These pages require no platform sign-in. Complete manual acceptance on the new release, permission denial and physical displays, VoiceOver/zoom, OS Reduce Motion and frame profiling remain open.</ns0:t>
+      </ns0:r>
+    </ns0:p>
+    <ns0:p>
+      <ns0:r>
+        <ns0:rPr>
+          <ns0:color ns0:val="000000"/>
+        </ns0:rPr>
+        <ns0:t>Next: follow NEXT_STEPS_2026-10-04.md, rehearse the 2 minute 50 second story, record the final video and complete owner submission declarations. No automatic editing, sending, publication, cloud sync or general geometry verification is implemented. Normal accounts and imported approvals were preserved.</ns0:t>
+      </ns0:r>
+    </ns0:p>
+    <ns0:p>
+      <ns0:r>
+        <ns0:rPr>
+          <ns0:color ns0:val="000000"/>
+        </ns0:rPr>
+        <ns0:br ns0:type="page"/>
+      </ns0:r>
+    </ns0:p>
+    <ns0:p>
+      <ns0:r>
+        <ns0:rPr>
+          <ns0:color ns0:val="000000"/>
+        </ns0:rPr>
         <ns0:t>Architecture export · updated 27 September 2026. Canonical source: ARCHITECTURE.md. Execution handover: docs/HANDOVER.md.</ns0:t>
       </ns0:r>
     </ns0:p>
@@ -12,6 +82,9 @@
         <ns0:pStyle ns0:val="Heading1"/>
       </ns0:pPr>
       <ns0:r>
+        <ns0:rPr>
+          <ns0:color ns0:val="000000"/>
+        </ns0:rPr>
         <ns0:t>Averill system design</ns0:t>
       </ns0:r>
     </ns0:p>
@@ -20,11 +93,17 @@
         <ns0:pStyle ns0:val="Heading2"/>
       </ns0:pPr>
       <ns0:r>
+        <ns0:rPr>
+          <ns0:color ns0:val="000000"/>
+        </ns0:rPr>
         <ns0:t>Purpose and status</ns0:t>
       </ns0:r>
     </ns0:p>
     <ns0:p>
       <ns0:r>
+        <ns0:rPr>
+          <ns0:color ns0:val="000000"/>
+        </ns0:rPr>
         <ns0:t>This document describes the implemented hackathon prototype and the boundaries for extending it. The current app is an Electron desktop demo with four supplied Elseweek work windows, a local company workspace, owner-scoped guided learning and weekly practice, and explicit one-frame OCR of a selected external Canva window. General continuous external application observation remains a future milestone.</ns0:t>
       </ns0:r>
     </ns0:p>
@@ -33,36 +112,57 @@
         <ns0:pStyle ns0:val="Heading2"/>
       </ns0:pPr>
       <ns0:r>
+        <ns0:rPr>
+          <ns0:color ns0:val="000000"/>
+        </ns0:rPr>
         <ns0:t>Requirements</ns0:t>
       </ns0:r>
     </ns0:p>
     <ns0:p>
       <ns0:r>
+        <ns0:rPr>
+          <ns0:color ns0:val="000000"/>
+        </ns0:rPr>
         <ns0:t>| Requirement | Current implementation |</ns0:t>
       </ns0:r>
     </ns0:p>
     <ns0:p>
       <ns0:r>
+        <ns0:rPr>
+          <ns0:color ns0:val="000000"/>
+        </ns0:rPr>
         <ns0:t>| Explicit employee choice of shared work | Per-window Share/Stop controls in the Averill window |</ns0:t>
       </ns0:r>
     </ns0:p>
     <ns0:p>
       <ns0:r>
+        <ns0:rPr>
+          <ns0:color ns0:val="000000"/>
+        </ns0:rPr>
         <ns0:t>| Feedback at a natural pause | Work windows send state after blur or selection change |</ns0:t>
       </ns0:r>
     </ns0:p>
     <ns0:p>
       <ns0:r>
+        <ns0:rPr>
+          <ns0:color ns0:val="000000"/>
+        </ns0:rPr>
         <ns0:t>| Source-backed corrections | Deterministic findings carry a local source object |</ns0:t>
       </ns0:r>
     </ns0:p>
     <ns0:p>
       <ns0:r>
+        <ns0:rPr>
+          <ns0:color ns0:val="000000"/>
+        </ns0:rPr>
         <ns0:t>| Campaign questions | Local lookup; optional Nebius source-constrained answer |</ns0:t>
       </ns0:r>
     </ns0:p>
     <ns0:p>
       <ns0:r>
+        <ns0:rPr>
+          <ns0:color ns0:val="000000"/>
+        </ns0:rPr>
         <ns0:t>| Human control | No automatic edit, send, or publish route |</ns0:t>
       </ns0:r>
     </ns0:p>
@@ -71,81 +171,129 @@
         <ns0:pStyle ns0:val="Heading2"/>
       </ns0:pPr>
       <ns0:r>
+        <ns0:rPr>
+          <ns0:color ns0:val="000000"/>
+        </ns0:rPr>
         <ns0:t>Components</ns0:t>
       </ns0:r>
     </ns0:p>
     <ns0:p>
       <ns0:r>
+        <ns0:rPr>
+          <ns0:color ns0:val="000000"/>
+        </ns0:rPr>
         <ns0:t>| Component | File | Responsibility |</ns0:t>
       </ns0:r>
     </ns0:p>
     <ns0:p>
       <ns0:r>
+        <ns0:rPr>
+          <ns0:color ns0:val="000000"/>
+        </ns0:rPr>
         <ns0:t>| Main process | travel-desktop/main.js | Creates windows, tracks open/shared state, computes snapshots, registers IPC handlers |</ns0:t>
       </ns0:r>
     </ns0:p>
     <ns0:p>
       <ns0:r>
+        <ns0:rPr>
+          <ns0:color ns0:val="000000"/>
+        </ns0:rPr>
         <ns0:t>| Preload bridge | travel-desktop/preload.js | Exposes narrow window.desktop methods to sandboxed renderers |</ns0:t>
       </ns0:r>
     </ns0:p>
     <ns0:p>
       <ns0:r>
+        <ns0:rPr>
+          <ns0:color ns0:val="000000"/>
+        </ns0:rPr>
         <ns0:t>| Averill renderer | travel-desktop/src/agent.html, agent.js | Window list, findings, question composer, source viewer, AI opt-in |</ns0:t>
       </ns0:r>
     </ns0:p>
     <ns0:p>
       <ns0:r>
+        <ns0:rPr>
+          <ns0:color ns0:val="000000"/>
+        </ns0:rPr>
         <ns0:t>| Work renderer | travel-desktop/src/work.html, work.js | Synthetic email, LinkedIn, social, handover fields and explicit draft save |</ns0:t>
       </ns0:r>
     </ns0:p>
     <ns0:p>
       <ns0:r>
+        <ns0:rPr>
+          <ns0:color ns0:val="000000"/>
+        </ns0:rPr>
         <ns0:t>| Rule engine | travel-desktop/src/engine.js | Pure issue checks and local campaign answers |</ns0:t>
       </ns0:r>
     </ns0:p>
     <ns0:p>
       <ns0:r>
+        <ns0:rPr>
+          <ns0:color ns0:val="000000"/>
+        </ns0:rPr>
         <ns0:t>| AI adapter | travel-desktop/src/assistant.js | Nebius model discovery, answer request, citation ID validation, local fallback |</ns0:t>
       </ns0:r>
     </ns0:p>
     <ns0:p>
       <ns0:r>
+        <ns0:rPr>
+          <ns0:color ns0:val="000000"/>
+        </ns0:rPr>
         <ns0:t>| Source registry | travel-desktop/src/campaign.js | Maps fixed source IDs to local source files and assets |</ns0:t>
       </ns0:r>
     </ns0:p>
     <ns0:p>
       <ns0:r>
+        <ns0:rPr>
+          <ns0:color ns0:val="000000"/>
+        </ns0:rPr>
         <ns0:t>| Design system | travel-desktop/design-system/ and src/agent-theme.css | Approved visual tokens and implemented assistant styling |</ns0:t>
       </ns0:r>
     </ns0:p>
     <ns0:p>
       <ns0:r>
+        <ns0:rPr>
+          <ns0:color ns0:val="000000"/>
+        </ns0:rPr>
         <ns0:t>| Company workspace | travel-desktop/src/workspace.js | Local accounts, session access, imported copies, approval, priority, and conflict detection |</ns0:t>
       </ns0:r>
     </ns0:p>
     <ns0:p>
       <ns0:r>
+        <ns0:rPr>
+          <ns0:color ns0:val="000000"/>
+        </ns0:rPr>
         <ns0:t>| Company answers | travel-desktop/src/workspace-answer.js | Approved-source retrieval, Nebius request, citation ID validation, local fallback |</ns0:t>
       </ns0:r>
     </ns0:p>
     <ns0:p>
       <ns0:r>
+        <ns0:rPr>
+          <ns0:color ns0:val="000000"/>
+        </ns0:rPr>
         <ns0:t>| Learning engine | travel-desktop/src/learning.js | Owner-scoped sessions, ordered confirmation, weekly eligibility, practice and feedback |</ns0:t>
       </ns0:r>
     </ns0:p>
     <ns0:p>
       <ns0:r>
+        <ns0:rPr>
+          <ns0:color ns0:val="000000"/>
+        </ns0:rPr>
         <ns0:t>| Learning UI | travel-desktop/src/learning-ui.js | Learn lesson/help, activity recording, weekly review and answer forms |</ns0:t>
       </ns0:r>
     </ns0:p>
     <ns0:p>
       <ns0:r>
+        <ns0:rPr>
+          <ns0:color ns0:val="000000"/>
+        </ns0:rPr>
         <ns0:t>| Public search | travel-desktop/src/web-search.js | Tavily search with a user-entered public query only |</ns0:t>
       </ns0:r>
     </ns0:p>
     <ns0:p>
       <ns0:r>
+        <ns0:rPr>
+          <ns0:color ns0:val="000000"/>
+        </ns0:rPr>
         <ns0:t>| macOS extraction | travel-desktop/scripts/extract-text.swift | PDF text and image OCR for imported files and selected-window frames |</ns0:t>
       </ns0:r>
     </ns0:p>
@@ -154,81 +302,129 @@
         <ns0:pStyle ns0:val="Heading2"/>
       </ns0:pPr>
       <ns0:r>
+        <ns0:rPr>
+          <ns0:color ns0:val="000000"/>
+        </ns0:rPr>
         <ns0:t>Data flow</ns0:t>
       </ns0:r>
     </ns0:p>
     <ns0:p>
       <ns0:r>
+        <ns0:rPr>
+          <ns0:color ns0:val="000000"/>
+        </ns0:rPr>
         <ns0:t>Employee edits supplied work window</ns0:t>
       </ns0:r>
     </ns0:p>
     <ns0:p>
       <ns0:r>
+        <ns0:rPr>
+          <ns0:color ns0:val="000000"/>
+        </ns0:rPr>
         <ns0:t xml:space="preserve">  -&gt; blur or selection change</ns0:t>
       </ns0:r>
     </ns0:p>
     <ns0:p>
       <ns0:r>
+        <ns0:rPr>
+          <ns0:color ns0:val="000000"/>
+        </ns0:rPr>
         <ns0:t xml:space="preserve">  -&gt; preload updateWork(kind, structured state)</ns0:t>
       </ns0:r>
     </ns0:p>
     <ns0:p>
       <ns0:r>
+        <ns0:rPr>
+          <ns0:color ns0:val="000000"/>
+        </ns0:rPr>
         <ns0:t xml:space="preserve">  -&gt; Electron main process validates sender and stores state</ns0:t>
       </ns0:r>
     </ns0:p>
     <ns0:p>
       <ns0:r>
+        <ns0:rPr>
+          <ns0:color ns0:val="000000"/>
+        </ns0:rPr>
         <ns0:t xml:space="preserve">  -&gt; if that window is shared, rule engine inspects state</ns0:t>
       </ns0:r>
     </ns0:p>
     <ns0:p>
       <ns0:r>
+        <ns0:rPr>
+          <ns0:color ns0:val="000000"/>
+        </ns0:rPr>
         <ns0:t xml:space="preserve">  -&gt; main process sends snapshot to Averill window</ns0:t>
       </ns0:r>
     </ns0:p>
     <ns0:p>
       <ns0:r>
+        <ns0:rPr>
+          <ns0:color ns0:val="000000"/>
+        </ns0:rPr>
         <ns0:t xml:space="preserve">  -&gt; finding shows cited local source</ns0:t>
       </ns0:r>
     </ns0:p>
     <ns0:p>
       <ns0:r>
+        <ns0:rPr>
+          <ns0:color ns0:val="000000"/>
+        </ns0:rPr>
         <ns0:t>Employee asks in Review</ns0:t>
       </ns0:r>
     </ns0:p>
     <ns0:p>
       <ns0:r>
+        <ns0:rPr>
+          <ns0:color ns0:val="000000"/>
+        </ns0:rPr>
         <ns0:t xml:space="preserve">  -&gt; if a supplied work window is shared, use the fixed synthetic campaign pack</ns0:t>
       </ns0:r>
     </ns0:p>
     <ns0:p>
       <ns0:r>
+        <ns0:rPr>
+          <ns0:color ns0:val="000000"/>
+        </ns0:rPr>
         <ns0:t xml:space="preserve">  -&gt; otherwise use approved, visible company workspace sources</ns0:t>
       </ns0:r>
     </ns0:p>
     <ns0:p>
       <ns0:r>
+        <ns0:rPr>
+          <ns0:color ns0:val="000000"/>
+        </ns0:rPr>
         <ns0:t xml:space="preserve">  -&gt; if Nebius AI was explicitly enabled and a key exists:</ns0:t>
       </ns0:r>
     </ns0:p>
     <ns0:p>
       <ns0:r>
+        <ns0:rPr>
+          <ns0:color ns0:val="000000"/>
+        </ns0:rPr>
         <ns0:t>send question + relevant approved, AI-permitted text sources to Nebius only when owner company AI policy is enabled</ns0:t>
       </ns0:r>
     </ns0:p>
     <ns0:p>
       <ns0:r>
+        <ns0:rPr>
+          <ns0:color ns0:val="000000"/>
+        </ns0:rPr>
         <ns0:t xml:space="preserve">       validate returned source IDs</ns0:t>
       </ns0:r>
     </ns0:p>
     <ns0:p>
       <ns0:r>
+        <ns0:rPr>
+          <ns0:color ns0:val="000000"/>
+        </ns0:rPr>
         <ns0:t xml:space="preserve">       fall back to a local answer on failure or invalid citation</ns0:t>
       </ns0:r>
     </ns0:p>
     <ns0:p>
       <ns0:r>
+        <ns0:rPr>
+          <ns0:color ns0:val="000000"/>
+        </ns0:rPr>
         <ns0:t>The work window calls work:update even when unshared; the main process stores the state but does not produce findings until the window is shared. This is a boundary of the current implementation to consider during the future external-app integration. Closing a work window removes its state and sharing status.</ns0:t>
       </ns0:r>
     </ns0:p>
@@ -237,16 +433,25 @@
         <ns0:pStyle ns0:val="Heading2"/>
       </ns0:pPr>
       <ns0:r>
+        <ns0:rPr>
+          <ns0:color ns0:val="000000"/>
+        </ns0:rPr>
         <ns0:t>IPC contracts</ns0:t>
       </ns0:r>
     </ns0:p>
     <ns0:p>
       <ns0:r>
+        <ns0:rPr>
+          <ns0:color ns0:val="000000"/>
+        </ns0:rPr>
         <ns0:t>The preload exposes snapshot(), openWork(kind), share(kind, enabled), aiMode(enabled), ask(question), askDemo(question), source(id), openSource(id), updateWork(kind, data), and snapshot/sharing listeners. It also exposes narrow workspace, Tavily, and external-window methods. kind is limited to email, linkedin, social, or handover. Main-process work:update accepts only events from the corresponding open work window and a plain object payload. The bridge uses context isolation, disables Node integration, and enables renderer sandboxing.</ns0:t>
       </ns0:r>
     </ns0:p>
     <ns0:p>
       <ns0:r>
+        <ns0:rPr>
+          <ns0:color ns0:val="000000"/>
+        </ns0:rPr>
         <ns0:t>The snapshot contains open, shared, aiEnabled, findings, workspace, learning, service availability and the selected external window. A finding has an ID, title, explanation, suggested user action, source, and work kind. Source IDs resolve only through the fixed registry; arbitrary paths are not accepted through agent:source or agent:open-source.</ns0:t>
       </ns0:r>
     </ns0:p>
@@ -255,11 +460,17 @@
         <ns0:pStyle ns0:val="Heading2"/>
       </ns0:pPr>
       <ns0:r>
+        <ns0:rPr>
+          <ns0:color ns0:val="000000"/>
+        </ns0:rPr>
         <ns0:t>Source and version model</ns0:t>
       </ns0:r>
     </ns0:p>
     <ns0:p>
       <ns0:r>
+        <ns0:rPr>
+          <ns0:color ns0:val="000000"/>
+        </ns0:rPr>
         <ns0:t>The fixed campaign source pack is static and synthetic. current-brief.md is the approved v2. old-brief.md is v1 and intentionally superseded. brand-and-legal.md controls copy and disclosures. content-calendar.md controls dates. Approved assets are the email hero and vertical Reel; the old square creative is an intentional wrong choice. The separate company workspace has local file/folder import, status, version, owner, department, priority, and same-title conflict detection. That detection does not establish full semantic consistency.</ns0:t>
       </ns0:r>
     </ns0:p>
@@ -268,16 +479,25 @@
         <ns0:pStyle ns0:val="Heading2"/>
       </ns0:pPr>
       <ns0:r>
+        <ns0:rPr>
+          <ns0:color ns0:val="000000"/>
+        </ns0:rPr>
         <ns0:t>AI and privacy boundary</ns0:t>
       </ns0:r>
     </ns0:p>
     <ns0:p>
       <ns0:r>
+        <ns0:rPr>
+          <ns0:color ns0:val="000000"/>
+        </ns0:rPr>
         <ns0:t>Local answers and deterministic findings need no network. Nebius uses NEBIUS_API_KEY from the environment/root .env.local or encrypted local Setup storage. Owner company policy and document permissions govern company AI; the employee enables Nebius for the session. A Review question with a shared demo window can send the question and fixed synthetic text pack; a company question can send relevant approved company text. Draft or OCR text is sent only after a separate confirmation in its review flow. The API key remains in the main process. The app does not send image binaries or perform continuous capture. If the model cannot be reached, returns malformed output, or fails citation validation, a local answer is used. Citation IDs are structurally validated; model sentences are not independently checked against passages.</ns0:t>
       </ns0:r>
     </ns0:p>
     <ns0:p>
       <ns0:r>
+        <ns0:rPr>
+          <ns0:color ns0:val="000000"/>
+        </ns0:rPr>
         <ns0:t>The public repository must never contain .env.local or credentials. .env.example lists variable names only. Do not log request headers, keys, or sensitive prompt content.</ns0:t>
       </ns0:r>
     </ns0:p>
@@ -286,26 +506,41 @@
         <ns0:pStyle ns0:val="Heading2"/>
       </ns0:pPr>
       <ns0:r>
+        <ns0:rPr>
+          <ns0:color ns0:val="000000"/>
+        </ns0:rPr>
         <ns0:t>Persistence and operations</ns0:t>
       </ns0:r>
     </ns0:p>
     <ns0:p>
       <ns0:r>
+        <ns0:rPr>
+          <ns0:color ns0:val="000000"/>
+        </ns0:rPr>
         <ns0:t>The supplied work windows save draft form state in renderer localStorage only when the employee selects Save draft. Separate local email/password accounts now identify the owner, marketing manager, strategist and content creator. Cloud file access uses registered-client OAuth; employee cloud login and background synchronization are not implemented. The app runs locally with npm ci and npm start; npm test runs Node's test runner. npm run package:mac builds an unsigned arm64 demo .app with the Swift OCR helper. The current prototype has no telemetry or crash reporting. Distribution for real company content still needs signing, updates, permissions, and data retention design.</ns0:t>
       </ns0:r>
     </ns0:p>
     <ns0:p>
       <ns0:r>
+        <ns0:rPr>
+          <ns0:color ns0:val="000000"/>
+        </ns0:rPr>
         <ns0:t>The company workspace is now stored as JSON in Electron's user-data directory, with imported copies and extracted text in an adjacent private local folder. Owner activation replaces role switching with separate local email/password authentication. Main-process session checks enforce role access; restart requires sign-in. The assistant main process enforces file visibility and source approval before answering. An administrator or department lead can approve proposed department sources. Private files remain visible only to their owner until proposed. The conflict detector currently catches different approved files sharing the same department and title; it cannot detect all semantic contradictions.</ns0:t>
       </ns0:r>
     </ns0:p>
     <ns0:p>
       <ns0:r>
+        <ns0:rPr>
+          <ns0:color ns0:val="000000"/>
+        </ns0:rPr>
         <ns0:t>Nebius receives question/draft and relevant approved text sources after consent; intake interpretation has separate file-text consent. Tavily receives only the explicit public query and returns external URLs. Live Nemotron intake checks passed for mixed files and three employees in unstructured prose. Prior approved company-source answering verification and remaining acceptance checks are recorded in docs/HANDOVER.md.</ns0:t>
       </ns0:r>
     </ns0:p>
     <ns0:p>
       <ns0:r>
+        <ns0:rPr>
+          <ns0:color ns0:val="000000"/>
+        </ns0:rPr>
         <ns0:t>Electron desktopCapturer lists windows. The user chooses a Canva-titled window; pressing Review captures one thumbnail frame, extracts visible text locally, and deletes the temporary PNG. Stop sharing clears the selected window. No continuous capture runs. A screenshot can miss hidden text or visual issues; the app labels the review as OCR.</ns0:t>
       </ns0:r>
     </ns0:p>
@@ -314,31 +549,49 @@
         <ns0:pStyle ns0:val="Heading2"/>
       </ns0:pPr>
       <ns0:r>
+        <ns0:rPr>
+          <ns0:color ns0:val="000000"/>
+        </ns0:rPr>
         <ns0:t>Known gaps and tradeoffs</ns0:t>
       </ns0:r>
     </ns0:p>
     <ns0:p>
       <ns0:r>
+        <ns0:rPr>
+          <ns0:color ns0:val="000000"/>
+        </ns0:rPr>
         <ns0:t>- Deterministic checks make the demo repeatable but cover only explicit campaign errors.</ns0:t>
       </ns0:r>
     </ns0:p>
     <ns0:p>
       <ns0:r>
+        <ns0:rPr>
+          <ns0:color ns0:val="000000"/>
+        </ns0:rPr>
         <ns0:t>- Structured work-window state is reliable but does not prove real desktop perception.</ns0:t>
       </ns0:r>
     </ns0:p>
     <ns0:p>
       <ns0:r>
+        <ns0:rPr>
+          <ns0:color ns0:val="000000"/>
+        </ns0:rPr>
         <ns0:t>- Static local sources enable transparent citations but do not handle company-wide retrieval or live document changes.</ns0:t>
       </ns0:r>
     </ns0:p>
     <ns0:p>
       <ns0:r>
+        <ns0:rPr>
+          <ns0:color ns0:val="000000"/>
+        </ns0:rPr>
         <ns0:t>- AI citations are checked for known IDs, not full factual entailment. Claims remain reviewable by the employee.</ns0:t>
       </ns0:r>
     </ns0:p>
     <ns0:p>
       <ns0:r>
+        <ns0:rPr>
+          <ns0:color ns0:val="000000"/>
+        </ns0:rPr>
         <ns0:t>- The assistant and supplied Elseweek work windows use Petrol / Coral / Ice, bundled fonts and matching outline icons. The Review pane has a focused finding and source hierarchy; operational controls are in Work.</ns0:t>
       </ns0:r>
     </ns0:p>
@@ -347,11 +600,17 @@
         <ns0:pStyle ns0:val="Heading2"/>
       </ns0:pPr>
       <ns0:r>
+        <ns0:rPr>
+          <ns0:color ns0:val="000000"/>
+        </ns0:rPr>
         <ns0:t>Extension sequence</ns0:t>
       </ns0:r>
     </ns0:p>
     <ns0:p>
       <ns0:r>
+        <ns0:rPr>
+          <ns0:color ns0:val="000000"/>
+        </ns0:rPr>
         <ns0:t>Verify the existing one-frame macOS Canva selection, permission handling, OCR, and Stop sharing end to end. Rehearse the packaged app and approved company-source Nebius path. Then evaluate cloud authentication and synchronization, stronger source-conflict and citation checks, and deletion/revocation behavior. Keep work actions human-owned unless the product decision changes explicitly. See docs/HANDOVER.md for the current checks and their evidence boundaries.</ns0:t>
       </ns0:r>
     </ns0:p>
@@ -360,26 +619,41 @@
         <ns0:pStyle ns0:val="Heading2"/>
       </ns0:pPr>
       <ns0:r>
+        <ns0:rPr>
+          <ns0:color ns0:val="000000"/>
+        </ns0:rPr>
         <ns0:t>Learning state and IPC</ns0:t>
       </ns0:r>
     </ns0:p>
     <ns0:p>
       <ns0:r>
+        <ns0:rPr>
+          <ns0:color ns0:val="000000"/>
+        </ns0:rPr>
         <ns0:t>learningAction(action, payload) invokes learning:action. Only the Averill renderer is accepted. The main process derives the active person from the workspace; payloads cannot choose another owner. Allowed actions: start, record, confirm, exclude, quiz and answer. The engine validates source eligibility, step order and answer shape before persistence and snapshot publication.</ns0:t>
       </ns0:r>
     </ns0:p>
     <ns0:p>
       <ns0:r>
+        <ns0:rPr>
+          <ns0:color ns0:val="000000"/>
+        </ns0:rPr>
         <ns0:t>State lives in the learning field of the existing schema-1 workspace: sessions and quizzes, each owner-scoped. Sessions carry creation time, confirmed operation timestamps/week keys, optional source ID/title/version/hash and exclusion/completion state. Manual work records contain a confirmed employee description. Quizzes persist prompts, deterministic answer keys and feedback; snapshots omit answer keys. Practical reflections are explicitly self-confirmed, not model-graded.</ns0:t>
       </ns0:r>
     </ns0:p>
     <ns0:p>
       <ns0:r>
+        <ns0:rPr>
+          <ns0:color ns0:val="000000"/>
+        </ns0:rPr>
         <ns0:t>Week keys are Monday-based in Europe/Copenhagen. Only confirmed current-week sessions are eligible. Company evidence must remain visible, approved, hash/version-matching and outside same-title conflicts. Excluding activity or invalidating evidence blocks affected questions. A fingerprint detects changed records so explicit refresh can create an updated set. Previous answers remain in local history; only the current person/current week is exposed by the learning snapshot.</ns0:t>
       </ns0:r>
     </ns0:p>
     <ns0:p>
       <ns0:r>
+        <ns0:rPr>
+          <ns0:color ns0:val="000000"/>
+        </ns0:rPr>
         <ns0:t>Learn is offline and stores no screenshots. The official guide opens only on an employee action. It neither connects to Canva’s document API nor proves element alignment. Existing Work capture is a separate explicit one-frame OCR route. Local account sessions isolate employee history on one Mac; there is no authentication or synchronization across devices.</ns0:t>
       </ns0:r>
     </ns0:p>
@@ -388,16 +662,25 @@
         <ns0:pStyle ns0:val="Heading1"/>
       </ns0:pPr>
       <ns0:r>
+        <ns0:rPr>
+          <ns0:color ns0:val="000000"/>
+        </ns0:rPr>
         <ns0:t>Company onboarding and login documents</ns0:t>
       </ns0:r>
     </ns0:p>
     <ns0:p>
       <ns0:r>
+        <ns0:rPr>
+          <ns0:color ns0:val="000000"/>
+        </ns0:rPr>
         <ns0:t>Updated 27 September 2026. File drop, local/synced files, HTTPS links and selected-file cloud imports feed local review. Knowledge shows uploaded proposals immediately and saved sources by role, with title/text search, status filters and local reading. Approval is separate from receipt and AI consent. Cloud OAuth requires registered clients and is live-unverified. See CLOUD_CONNECTIONS.md and ONBOARDING_TUTORIAL.md.</ns0:t>
       </ns0:r>
     </ns0:p>
     <ns0:p>
       <ns0:r>
+        <ns0:rPr>
+          <ns0:color ns0:val="000000"/>
+        </ns0:rPr>
         <ns0:t>Four profiles map owner to admin, marketing manager to lead, and marketing strategy employee and content creator to employee. Passwords use asynchronous scrypt hashes. At the user's request, owner and generated team credentials also receive separate local Markdown login documents under userData/Averill-login-documents. Only an authenticated administrator can open the folder through Account access. Documents are outside Git, company source ingestion, snapshots and Nebius prompts. Admin reset of another non-owner local account and self-service password change are available. No invitation delivery or unauthenticated owner recovery is implemented.</ns0:t>
       </ns0:r>
     </ns0:p>
@@ -406,16 +689,25 @@
         <ns0:pStyle ns0:val="Heading1"/>
       </ns0:pPr>
       <ns0:r>
+        <ns0:rPr>
+          <ns0:color ns0:val="000000"/>
+        </ns0:rPr>
         <ns0:t>Build and development continuation</ns0:t>
       </ns0:r>
     </ns0:p>
     <ns0:p>
       <ns0:r>
+        <ns0:rPr>
+          <ns0:color ns0:val="000000"/>
+        </ns0:rPr>
         <ns0:t>Open travel-desktop/dist/Averill-darwin-arm64/Averill.app on Apple Silicon macOS; archive: dist/Averill-macOS-arm64.zip. A persistent banner reports working, completed, cancelled and failed actions. Intake reports received/readable files and warnings. Thirty-three Node tests pass as of 28 September 2026. Native feedback checks verify proposal visibility, local text reading, approved knowledge, search, viewport and logout cleanup. Reproduce with npm run verify:feedback; HANDOVER.md records the evidence.</ns0:t>
       </ns0:r>
     </ns0:p>
     <ns0:p>
       <ns0:r>
+        <ns0:rPr>
+          <ns0:color ns0:val="000000"/>
+        </ns0:rPr>
         <ns0:t>Company AI defaults off. Owner authorization and explicit file selection are required; restricted or credential-looking sources cannot enter Nebius prompts. OAuth consent is separate from AI permission. Provider confidentiality, retention, region and training opt-out require account-specific verification. Local company copies use OS permissions, not application encryption. See COMPANY_CONFIDENTIALITY.md for production gaps. Password documents remain local and ignored by Git.</ns0:t>
       </ns0:r>
     </ns0:p>
@@ -424,21 +716,33 @@
         <ns0:pStyle ns0:val="Heading1"/>
       </ns0:pPr>
       <ns0:r>
+        <ns0:rPr>
+          <ns0:color ns0:val="000000"/>
+        </ns0:rPr>
         <ns0:t>Addition pass — 28 September 2026</ns0:t>
       </ns0:r>
     </ns0:p>
     <ns0:p>
       <ns0:r>
+        <ns0:rPr>
+          <ns0:color ns0:val="000000"/>
+        </ns0:rPr>
         <ns0:t>Review findings can start a person-owned correction exercise, copy the suggested correction and recheck supported shared fields after a human edit. Learn adds composition, LinkedIn visual and newsletter export projects, bounded offline step questions, and an optional explicit one-frame Canva OCR capture. Employee confirmation remains separate from deterministic rule clearance; export and geometry are not verified.</ns0:t>
       </ns0:r>
     </ns0:p>
     <ns0:p>
       <ns0:r>
+        <ns0:rPr>
+          <ns0:color ns0:val="000000"/>
+        </ns0:rPr>
         <ns0:t>Company answers cite exact extracted passages with version, approval metadata and line/page when available. Optional model answers are accepted only as exact extracts of validated source quotes. Knowledge supports local search filters, a bounded line comparison, reviewer reasons, explicit replacement links across different titles and private clarification requests.</ns0:t>
       </ns0:r>
     </ns0:p>
     <ns0:p>
       <ns0:r>
+        <ns0:rPr>
+          <ns0:color ns0:val="000000"/>
+        </ns0:rPr>
         <ns0:t>Admins can disable/reset another non-owner local account; signed-in people can change their own passwords. Managed source copies and personal learning history can be deleted explicitly. Applied onboarding staging files are cleaned up. Workspace text and source copies are not application-encrypted. Multi-device sync, production tenant isolation, delivered invitations, signed/notarized distribution and live OAuth proof remain external release gates. See docs/ADDITIONS_STATUS.md, docs/AB_TEST_PLAN.md and docs/HANDOVER.md for exact status and verification.</ns0:t>
       </ns0:r>
     </ns0:p>
@@ -1003,6 +1307,9 @@
   </w:docDefaults>
   <w:style w:type="table" w:styleId="TableNormal" w:default="1">
     <w:name w:val="TableNormal"/>
+    <w:rPr>
+      <w:color w:val="000000"/>
+    </w:rPr>
     <w:tblPr>
       <w:tblCellMar>
         <w:top w:w="100.0" w:type="dxa"/>
@@ -1014,6 +1321,9 @@
   </w:style>
   <w:style w:type="paragraph" w:styleId="Normal" w:default="1">
     <w:name w:val="normal"/>
+    <w:rPr>
+      <w:color w:val="000000"/>
+    </w:rPr>
   </w:style>
   <w:style w:type="paragraph" w:styleId="Heading1">
     <w:name w:val="heading 1"/>
@@ -1033,7 +1343,7 @@
     <w:rPr>
       <w:b w:val="1"/>
       <w:bCs w:val="1"/>
-      <w:color w:val="082a4a"/>
+      <w:color w:val="000000"/>
       <w:sz w:val="27"/>
       <w:szCs w:val="27"/>
     </w:rPr>
@@ -1052,7 +1362,7 @@
       <w:b w:val="1"/>
       <w:bCs w:val="1"/>
       <w:smallCaps w:val="1"/>
-      <w:color w:val="082a4a"/>
+      <w:color w:val="000000"/>
       <w:sz w:val="19"/>
       <w:szCs w:val="19"/>
     </w:rPr>
@@ -1069,7 +1379,7 @@
       <w:rFonts w:ascii="Helvetica Neue" w:cs="Helvetica Neue" w:eastAsia="Helvetica Neue" w:hAnsi="Helvetica Neue"/>
       <w:b w:val="1"/>
       <w:bCs w:val="1"/>
-      <w:color w:val="5b7085"/>
+      <w:color w:val="000000"/>
     </w:rPr>
   </w:style>
   <w:style w:type="paragraph" w:styleId="Heading4">
@@ -1087,7 +1397,7 @@
       <w:bCs w:val="1"/>
       <w:i w:val="1"/>
       <w:iCs w:val="1"/>
-      <w:color w:val="082a4a"/>
+      <w:color w:val="000000"/>
     </w:rPr>
   </w:style>
   <w:style w:type="paragraph" w:styleId="Heading5">
@@ -1101,7 +1411,7 @@
     </w:pPr>
     <w:rPr>
       <w:rFonts w:ascii="Calibri" w:cs="Calibri" w:eastAsia="Calibri" w:hAnsi="Calibri"/>
-      <w:color w:val="082a4a"/>
+      <w:color w:val="000000"/>
     </w:rPr>
   </w:style>
   <w:style w:type="paragraph" w:styleId="Heading6">
@@ -1117,7 +1427,7 @@
       <w:rFonts w:ascii="Calibri" w:cs="Calibri" w:eastAsia="Calibri" w:hAnsi="Calibri"/>
       <w:i w:val="1"/>
       <w:iCs w:val="1"/>
-      <w:color w:val="082a4a"/>
+      <w:color w:val="000000"/>
     </w:rPr>
   </w:style>
   <w:style w:type="paragraph" w:styleId="Title">
@@ -1130,7 +1440,7 @@
     <w:rPr>
       <w:b w:val="1"/>
       <w:bCs w:val="1"/>
-      <w:color w:val="082a4a"/>
+      <w:color w:val="000000"/>
       <w:sz w:val="44"/>
       <w:szCs w:val="44"/>
     </w:rPr>
@@ -1144,13 +1454,16 @@
       <w:rFonts w:ascii="Calibri" w:cs="Calibri" w:eastAsia="Calibri" w:hAnsi="Calibri"/>
       <w:i w:val="1"/>
       <w:iCs w:val="1"/>
-      <w:color w:val="082a4a"/>
+      <w:color w:val="000000"/>
       <w:sz w:val="24"/>
       <w:szCs w:val="24"/>
     </w:rPr>
   </w:style>
   <w:style w:type="table" w:styleId="Table1">
     <w:basedOn w:val="TableNormal"/>
+    <w:rPr>
+      <w:color w:val="000000"/>
+    </w:rPr>
     <w:tblPr>
       <w:tblStyleRowBandSize w:val="1"/>
       <w:tblStyleColBandSize w:val="1"/>
@@ -1161,6 +1474,9 @@
     <w:pPr>
       <w:spacing w:after="0" w:line="240" w:lineRule="auto"/>
     </w:pPr>
+    <w:rPr>
+      <w:color w:val="000000"/>
+    </w:rPr>
     <w:tblPr>
       <w:tblStyleRowBandSize w:val="1"/>
       <w:tblStyleColBandSize w:val="1"/>
@@ -1213,6 +1529,9 @@
     <w:pPr>
       <w:spacing w:after="0" w:line="240" w:lineRule="auto"/>
     </w:pPr>
+    <w:rPr>
+      <w:color w:val="000000"/>
+    </w:rPr>
     <w:tblPr>
       <w:tblStyleRowBandSize w:val="1"/>
       <w:tblStyleColBandSize w:val="1"/>
@@ -1265,6 +1584,9 @@
     <w:pPr>
       <w:spacing w:after="0" w:line="240" w:lineRule="auto"/>
     </w:pPr>
+    <w:rPr>
+      <w:color w:val="000000"/>
+    </w:rPr>
     <w:tblPr>
       <w:tblStyleRowBandSize w:val="1"/>
       <w:tblStyleColBandSize w:val="1"/>
@@ -1317,6 +1639,9 @@
     <w:pPr>
       <w:spacing w:after="0" w:line="240" w:lineRule="auto"/>
     </w:pPr>
+    <w:rPr>
+      <w:color w:val="000000"/>
+    </w:rPr>
     <w:tblPr>
       <w:tblStyleRowBandSize w:val="1"/>
       <w:tblStyleColBandSize w:val="1"/>
@@ -1369,6 +1694,9 @@
     <w:pPr>
       <w:spacing w:after="0" w:line="240" w:lineRule="auto"/>
     </w:pPr>
+    <w:rPr>
+      <w:color w:val="000000"/>
+    </w:rPr>
     <w:tblPr>
       <w:tblStyleRowBandSize w:val="1"/>
       <w:tblStyleColBandSize w:val="1"/>
@@ -1421,6 +1749,9 @@
     <w:pPr>
       <w:spacing w:after="0" w:line="240" w:lineRule="auto"/>
     </w:pPr>
+    <w:rPr>
+      <w:color w:val="000000"/>
+    </w:rPr>
     <w:tblPr>
       <w:tblStyleRowBandSize w:val="1"/>
       <w:tblStyleColBandSize w:val="1"/>
@@ -1473,6 +1804,9 @@
     <w:pPr>
       <w:spacing w:after="0" w:line="240" w:lineRule="auto"/>
     </w:pPr>
+    <w:rPr>
+      <w:color w:val="000000"/>
+    </w:rPr>
     <w:tblPr>
       <w:tblStyleRowBandSize w:val="1"/>
       <w:tblStyleColBandSize w:val="1"/>
@@ -1525,6 +1859,9 @@
     <w:pPr>
       <w:spacing w:after="0" w:line="240" w:lineRule="auto"/>
     </w:pPr>
+    <w:rPr>
+      <w:color w:val="000000"/>
+    </w:rPr>
     <w:tblPr>
       <w:tblStyleRowBandSize w:val="1"/>
       <w:tblStyleColBandSize w:val="1"/>

</xml_diff>